<commit_message>
[D11] Inclui o link do commit na retrospectiva da Entrega 1
</commit_message>
<xml_diff>
--- a/docs/assets/retrospectiva-e1.docx
+++ b/docs/assets/retrospectiva-e1.docx
@@ -3206,47 +3206,7 @@
           <w:szCs w:val="24"/>
           <w:lang w:val="pt-BR"/>
         </w:rPr>
-        <w:t xml:space="preserve">Entreguem um PDF por equipe no moodle e indique aqui </w:t>
-      </w:r>
-      <w:r>
-        <w:rPr>
-          <w:rFonts w:ascii="Cambria" w:hAnsi="Cambria" w:asciiTheme="minorAscii" w:hAnsiTheme="minorAscii"/>
-          <w:color w:val="auto"/>
-          <w:sz w:val="24"/>
-          <w:szCs w:val="24"/>
-          <w:lang w:val="pt-BR"/>
-        </w:rPr>
-        <w:t>o link</w:t>
-      </w:r>
-      <w:r>
-        <w:rPr>
-          <w:rFonts w:ascii="Cambria" w:hAnsi="Cambria" w:asciiTheme="minorAscii" w:hAnsiTheme="minorAscii"/>
-          <w:color w:val="auto"/>
-          <w:sz w:val="24"/>
-          <w:szCs w:val="24"/>
-          <w:lang w:val="pt-BR"/>
-        </w:rPr>
-        <w:t xml:space="preserve"> para o </w:t>
-      </w:r>
-      <w:r>
-        <w:rPr>
-          <w:rFonts w:ascii="Cambria" w:hAnsi="Cambria" w:asciiTheme="minorAscii" w:hAnsiTheme="minorAscii"/>
-          <w:color w:val="auto"/>
-          <w:sz w:val="24"/>
-          <w:szCs w:val="24"/>
-          <w:lang w:val="pt-BR"/>
-        </w:rPr>
-        <w:t>commit</w:t>
-      </w:r>
-      <w:r>
-        <w:rPr>
-          <w:rFonts w:ascii="Cambria" w:hAnsi="Cambria" w:asciiTheme="minorAscii" w:hAnsiTheme="minorAscii"/>
-          <w:color w:val="auto"/>
-          <w:sz w:val="24"/>
-          <w:szCs w:val="24"/>
-          <w:lang w:val="pt-BR"/>
-        </w:rPr>
-        <w:t xml:space="preserve"> no repositório da equipe. </w:t>
+        <w:t xml:space="preserve">Entreguem um PDF por equipe no moodle e indique aqui o link para o commit no repositório da equipe. </w:t>
       </w:r>
     </w:p>
     <w:p>
@@ -3283,68 +3243,22 @@
           <w:szCs w:val="24"/>
           <w:lang w:val="pt-BR"/>
         </w:rPr>
-        <w:t xml:space="preserve">Link para o </w:t>
+        <w:t xml:space="preserve">Link para o commit no repositório:</w:t>
+        <w:br/>
       </w:r>
-      <w:r>
-        <w:rPr>
-          <w:rFonts w:ascii="Cambria" w:hAnsi="Cambria" w:asciiTheme="minorAscii" w:hAnsiTheme="minorAscii"/>
-          <w:b w:val="1"/>
-          <w:bCs w:val="1"/>
-          <w:color w:val="auto"/>
-          <w:sz w:val="24"/>
-          <w:szCs w:val="24"/>
-          <w:lang w:val="pt-BR"/>
-        </w:rPr>
-        <w:t>commit</w:t>
-      </w:r>
-      <w:r>
-        <w:rPr>
-          <w:rFonts w:ascii="Cambria" w:hAnsi="Cambria" w:asciiTheme="minorAscii" w:hAnsiTheme="minorAscii"/>
-          <w:b w:val="1"/>
-          <w:bCs w:val="1"/>
-          <w:color w:val="auto"/>
-          <w:sz w:val="24"/>
-          <w:szCs w:val="24"/>
-          <w:lang w:val="pt-BR"/>
-        </w:rPr>
-        <w:t xml:space="preserve"> no </w:t>
-      </w:r>
-      <w:r>
-        <w:rPr>
-          <w:rFonts w:ascii="Cambria" w:hAnsi="Cambria" w:asciiTheme="minorAscii" w:hAnsiTheme="minorAscii"/>
-          <w:b w:val="1"/>
-          <w:bCs w:val="1"/>
-          <w:color w:val="auto"/>
-          <w:sz w:val="24"/>
-          <w:szCs w:val="24"/>
-          <w:lang w:val="pt-BR"/>
-        </w:rPr>
-        <w:t>repositó</w:t>
-      </w:r>
-      <w:r>
-        <w:rPr>
-          <w:rFonts w:ascii="Cambria" w:hAnsi="Cambria" w:asciiTheme="minorAscii" w:hAnsiTheme="minorAscii"/>
-          <w:b w:val="1"/>
-          <w:bCs w:val="1"/>
-          <w:color w:val="auto"/>
-          <w:sz w:val="24"/>
-          <w:szCs w:val="24"/>
-          <w:lang w:val="pt-BR"/>
-        </w:rPr>
-        <w:t>rio</w:t>
-      </w:r>
-      <w:r>
-        <w:rPr>
-          <w:rFonts w:ascii="Cambria" w:hAnsi="Cambria" w:asciiTheme="minorAscii" w:hAnsiTheme="minorAscii"/>
-          <w:b w:val="1"/>
-          <w:bCs w:val="1"/>
-          <w:color w:val="auto"/>
-          <w:sz w:val="24"/>
-          <w:szCs w:val="24"/>
-          <w:lang w:val="pt-BR"/>
-        </w:rPr>
-        <w:t>: _____________________________________________</w:t>
-      </w:r>
+      <w:hyperlink r:id="rIdCommitLink" w:history="1">
+        <w:r>
+          <w:rPr>
+            <w:rFonts w:ascii="Cambria" w:hAnsi="Cambria" w:asciiTheme="minorAscii" w:hAnsiTheme="minorAscii"/>
+            <w:color w:val="0563C1"/>
+            <w:sz w:val="20"/>
+            <w:szCs w:val="20"/>
+            <w:u w:val="single"/>
+            <w:lang w:val="pt-BR"/>
+          </w:rPr>
+          <w:t>https://github.com/FCTE-Qualidade-de-Software-1/2026-2_T02_ADELE_GOLDSTINE/commit/c84bf5ff640d0a1f1c1340351dcdd932c9a81775</w:t>
+        </w:r>
+      </w:hyperlink>
     </w:p>
     <w:p>
       <w:pPr>

</xml_diff>